<commit_message>
docs(M7): align BR-001 and BR-005 with the 28/10 notice and consultation decisions
</commit_message>
<xml_diff>
--- a/docs/word/specs/spec-M7.docx
+++ b/docs/word/specs/spec-M7.docx
@@ -4150,22 +4150,22 @@
               <w:rPr>
                 <w:sz w:val="17"/>
               </w:rPr>
-              <w:t xml:space="preserve">Notices are sent in VFDA's name, never directly by the producer.</w:t>
-            </w:r>
-          </w:p>
-        </w:tc>
-        <w:tc>
-          <w:tcPr/>
-          <w:p>
-            <w:pPr>
-              <w:pStyle w:val="Compact"/>
-              <w:jc w:val="left"/>
-            </w:pPr>
-            <w:r>
-              <w:rPr>
-                <w:sz w:val="17"/>
-              </w:rPr>
-              <w:t xml:space="preserve">VFDA is the relationship holder with local government.</w:t>
+              <w:t xml:space="preserve">The system never sends a notice. It drafts the notice; a VFDA staff member reviews it (SC-32); only the approved version can be downloaded, and the producer sends it to the recipient they choose (Clarifications Q1–Q3, 28/10/2026).</w:t>
+            </w:r>
+          </w:p>
+        </w:tc>
+        <w:tc>
+          <w:tcPr/>
+          <w:p>
+            <w:pPr>
+              <w:pStyle w:val="Compact"/>
+              <w:jc w:val="left"/>
+            </w:pPr>
+            <w:r>
+              <w:rPr>
+                <w:sz w:val="17"/>
+              </w:rPr>
+              <w:t xml:space="preserve">VFDA's mandate to write to provinces is unconfirmed; a human still checks every notice.</w:t>
             </w:r>
           </w:p>
         </w:tc>
@@ -4338,7 +4338,7 @@
               <w:rPr>
                 <w:sz w:val="17"/>
               </w:rPr>
-              <w:t xml:space="preserve">Consultation booking (SC-33) is offered only after VFDA has declared its staffed hours and reply time; until then SC-33 shows VFDA's contact email instead of the booking form.</w:t>
+              <w:t xml:space="preserve">In the MVP, SC-33 is a consultation request, not a slot calendar: the member sends topic and preferred times, and VFDA staff reply with a proposed time by email (Clarifications Q5, 28/10/2026). A slot calendar is offered only after VFDA declares its staffed hours.</w:t>
             </w:r>
           </w:p>
         </w:tc>
@@ -6885,37 +6885,124 @@
               <w:rPr>
                 <w:sz w:val="17"/>
               </w:rPr>
-              <w:t xml:space="preserve">Sent automatically by a database webhook (SEQ-11)</w:t>
-            </w:r>
-          </w:p>
-        </w:tc>
-        <w:tc>
-          <w:tcPr/>
-          <w:p>
-            <w:pPr>
-              <w:pStyle w:val="Compact"/>
-              <w:jc w:val="left"/>
-            </w:pPr>
-            <w:r>
-              <w:rPr>
-                <w:sz w:val="17"/>
-              </w:rPr>
-              <w:t xml:space="preserve">Drafted automatically, reviewed and sent by VFDA staff (SC-32)</w:t>
-            </w:r>
-          </w:p>
-        </w:tc>
-        <w:tc>
-          <w:tcPr/>
-          <w:p>
-            <w:pPr>
-              <w:pStyle w:val="Compact"/>
-              <w:jc w:val="left"/>
-            </w:pPr>
-            <w:r>
-              <w:rPr>
-                <w:sz w:val="17"/>
-              </w:rPr>
-              <w:t xml:space="preserve">Open — see §10</w:t>
+              <w:t xml:space="preserve">Sent automatically by a database webhook (SEQ-11); F-M7-02 sends from VFDA's domain</w:t>
+            </w:r>
+          </w:p>
+        </w:tc>
+        <w:tc>
+          <w:tcPr/>
+          <w:p>
+            <w:pPr>
+              <w:pStyle w:val="Compact"/>
+              <w:jc w:val="left"/>
+            </w:pPr>
+            <w:r>
+              <w:rPr>
+                <w:sz w:val="17"/>
+              </w:rPr>
+              <w:t xml:space="preserve">Drafted automatically, reviewed by VFDA staff (SC-32), downloaded and sent by the producer;</w:t>
+            </w:r>
+            <w:r>
+              <w:rPr>
+                <w:sz w:val="17"/>
+              </w:rPr>
+              <w:t xml:space="preserve"> </w:t>
+            </w:r>
+            <w:r>
+              <w:rPr>
+                <w:rStyle w:val="VerbatimChar"/>
+                <w:sz w:val="17"/>
+              </w:rPr>
+              <w:t xml:space="preserve">delivery_status</w:t>
+            </w:r>
+            <w:r>
+              <w:rPr>
+                <w:sz w:val="17"/>
+              </w:rPr>
+              <w:t xml:space="preserve"> </w:t>
+            </w:r>
+            <w:r>
+              <w:rPr>
+                <w:sz w:val="17"/>
+              </w:rPr>
+              <w:t xml:space="preserve">records the download, not an email (BR-001)</w:t>
+            </w:r>
+          </w:p>
+        </w:tc>
+        <w:tc>
+          <w:tcPr/>
+          <w:p>
+            <w:pPr>
+              <w:pStyle w:val="Compact"/>
+              <w:jc w:val="left"/>
+            </w:pPr>
+            <w:r>
+              <w:rPr>
+                <w:sz w:val="17"/>
+              </w:rPr>
+              <w:t xml:space="preserve">Group C decision 28/10/2026 — VFDA to confirm</w:t>
+            </w:r>
+          </w:p>
+        </w:tc>
+      </w:tr>
+      <w:tr>
+        <w:tc>
+          <w:tcPr/>
+          <w:p>
+            <w:pPr>
+              <w:pStyle w:val="Compact"/>
+              <w:jc w:val="left"/>
+            </w:pPr>
+            <w:r>
+              <w:rPr>
+                <w:sz w:val="17"/>
+              </w:rPr>
+              <w:t xml:space="preserve">Consultation booking</w:t>
+            </w:r>
+          </w:p>
+        </w:tc>
+        <w:tc>
+          <w:tcPr/>
+          <w:p>
+            <w:pPr>
+              <w:pStyle w:val="Compact"/>
+              <w:jc w:val="left"/>
+            </w:pPr>
+            <w:r>
+              <w:rPr>
+                <w:sz w:val="17"/>
+              </w:rPr>
+              <w:t xml:space="preserve">F-M7-05..07: slot booking with time zones, confirmation and reminders</w:t>
+            </w:r>
+          </w:p>
+        </w:tc>
+        <w:tc>
+          <w:tcPr/>
+          <w:p>
+            <w:pPr>
+              <w:pStyle w:val="Compact"/>
+              <w:jc w:val="left"/>
+            </w:pPr>
+            <w:r>
+              <w:rPr>
+                <w:sz w:val="17"/>
+              </w:rPr>
+              <w:t xml:space="preserve">Request + email reply in the MVP (BR-005); F-M7-05..07 kept for a later phase</w:t>
+            </w:r>
+          </w:p>
+        </w:tc>
+        <w:tc>
+          <w:tcPr/>
+          <w:p>
+            <w:pPr>
+              <w:pStyle w:val="Compact"/>
+              <w:jc w:val="left"/>
+            </w:pPr>
+            <w:r>
+              <w:rPr>
+                <w:sz w:val="17"/>
+              </w:rPr>
+              <w:t xml:space="preserve">Group C decision 28/10/2026 — VFDA to confirm</w:t>
             </w:r>
           </w:p>
         </w:tc>

</xml_diff>